<commit_message>
feat(vitroflex-docs): cierra ajustes finales de tabla CR y textos de permisos
</commit_message>
<xml_diff>
--- a/tests/evidence_vitroflex/real_run/api_smoke_generate.docx
+++ b/tests/evidence_vitroflex/real_run/api_smoke_generate.docx
@@ -776,7 +776,7 @@
                 <w:color w:val="1F1F1F"/>
                 <w:lang w:val="es-MX" w:eastAsia="es-MX"/>
               </w:rPr>
-              <w:t>PERMISO A PARTIR DEL:</w:t>
+              <w:t>Permiso a partir del:</w:t>
             </w:r>
           </w:p>
         </w:tc>
@@ -855,7 +855,7 @@
                 <w:color w:val="1F1F1F"/>
                 <w:lang w:val="es-MX" w:eastAsia="es-MX"/>
               </w:rPr>
-              <w:t>Y HASTA EL DIA:</w:t>
+              <w:t>Y hasta el día:</w:t>
             </w:r>
           </w:p>
         </w:tc>

</xml_diff>